<commit_message>
Update Arne Floh email to institutional address (arne.floh@wu.ac.at)
Co-Authored-By: Claude Opus 4.8 <noreply@anthropic.com>
Claude-Session: https://claude.ai/code/session_01467iCMchpirXZm1er2TZxF
</commit_message>
<xml_diff>
--- a/Selling_the_Nation_Title_Page.docx
+++ b/Selling_the_Nation_Title_Page.docx
@@ -178,7 +178,7 @@
           <w:szCs w:val="22"/>
           <w:lang w:val="en-US"/>
         </w:rPr>
-        <w:t xml:space="preserve">arne.floh@gmail.com</w:t>
+        <w:t xml:space="preserve">arne.floh@wu.ac.at</w:t>
       </w:r>
     </w:p>
     <w:p>
@@ -231,7 +231,7 @@
           <w:szCs w:val="24"/>
           <w:lang w:val="en-US"/>
         </w:rPr>
-        <w:t xml:space="preserve">Dr. Arne Floh, arne.floh@gmail.com</w:t>
+        <w:t xml:space="preserve">Dr. Arne Floh, arne.floh@wu.ac.at</w:t>
       </w:r>
     </w:p>
     <w:p>

</xml_diff>

<commit_message>
Add WU Vienna / Institute for International Business affiliation for both authors
Co-Authored-By: Claude Opus 4.8 <noreply@anthropic.com>
Claude-Session: https://claude.ai/code/session_01467iCMchpirXZm1er2TZxF
</commit_message>
<xml_diff>
--- a/Selling_the_Nation_Title_Page.docx
+++ b/Selling_the_Nation_Title_Page.docx
@@ -79,7 +79,7 @@
           <w:szCs w:val="22"/>
           <w:lang w:val="en-US"/>
         </w:rPr>
-        <w:t xml:space="preserve">[Department / Institute, Institution, City, Country]</w:t>
+        <w:t xml:space="preserve">Institute for International Business, WU Vienna University of Economics and Business, Vienna, Austria</w:t>
       </w:r>
     </w:p>
     <w:p>
@@ -157,7 +157,7 @@
           <w:szCs w:val="22"/>
           <w:lang w:val="en-US"/>
         </w:rPr>
-        <w:t xml:space="preserve">[Department / Institute, Institution, City, Country]</w:t>
+        <w:t xml:space="preserve">Institute for International Business, WU Vienna University of Economics and Business, Vienna, Austria</w:t>
       </w:r>
     </w:p>
     <w:p>
@@ -284,7 +284,7 @@
           <w:szCs w:val="22"/>
           <w:lang w:val="en-US"/>
         </w:rPr>
-        <w:t xml:space="preserve">Prof. Dr. Alexander Mohr is [position] at [institution]. [Short biography – research interests, selected outlets.]</w:t>
+        <w:t xml:space="preserve">Prof. Dr. Alexander Mohr is [position] at WU Vienna University of Economics and Business. [Short biography – research interests, selected outlets.]</w:t>
       </w:r>
     </w:p>
     <w:p>
@@ -304,7 +304,7 @@
           <w:szCs w:val="22"/>
           <w:lang w:val="en-US"/>
         </w:rPr>
-        <w:t xml:space="preserve">Dr. Arne Floh is [position] at [institution]. [Short biography – research interests, selected outlets.]</w:t>
+        <w:t xml:space="preserve">Dr. Arne Floh is [position] at WU Vienna University of Economics and Business. [Short biography – research interests, selected outlets.]</w:t>
       </w:r>
     </w:p>
     <w:p>

</xml_diff>